<commit_message>
Add 1-5 fix and 2-1 cluster article
Co-Authored-By: Claude Sonnet 5.5 <noreply@anthropic.com>
Claude-Session: https://claude.ai/code/session_01RDJTtKr9HMuxx53mCe6avT
</commit_message>
<xml_diff>
--- a/01. 일하는 방식의 변화/Part 1. 산업의 판이 바뀔 때 l 5화 기술 표준 경쟁, 표준을 쥔 기업이 시장을 쥔다 NACS 48%와 5G 표준특허의 힘.docx
+++ b/01. 일하는 방식의 변화/Part 1. 산업의 판이 바뀔 때 l 5화 기술 표준 경쟁, 표준을 쥔 기업이 시장을 쥔다 NACS 48%와 5G 표준특허의 힘.docx
@@ -27,7 +27,7 @@
         <w:spacing w:after="160" w:line="360" w:lineRule="auto"/>
       </w:pPr>
       <w:r>
-        <w:t xml:space="preserve">충전 단자는 눈에 보이는 작은 부품이지만 시장의 문을 여닫는 열쇠입니다. 같은 문에 맞는 열쇠를 가진 쪽이 시장에 들어갑니다. 기술표준 경쟁은 어느 회사의 제품이 더 낫느냐보다 어느 규격 위에서 시장이 돌아가느냐를 두고 벌어집니다.</w:t>
+        <w:t xml:space="preserve">충전 단자는 눈에 보이는 작은 부품이지만 시장의 문을 여닫는 열쇠입니다. 같은 문에 맞는 열쇠를 가진 쪽이 시장에 들어갑니다. 단자 하나가 곧 하나의 시장 입장권이 되는 이유입니다. 기술표준 경쟁은 어느 회사의 제품이 더 낫느냐보다 어느 규격 위에서 시장이 돌아가느냐를 두고 벌어집니다.</w:t>
       </w:r>
     </w:p>
     <w:p>
@@ -60,7 +60,7 @@
         <w:spacing w:after="160" w:line="360" w:lineRule="auto"/>
       </w:pPr>
       <w:r>
-        <w:t xml:space="preserve">NACS는 교류와 직류 급속 충전을 하나의 단자로 처리하는 작은 규격입니다. 테슬라가 2022년에 설계를 공개하고 다른 완성차와 충전 사업자에게 쓰라고 권했습니다. 북미에서 테슬라 외 전기차 대부분은 CCS1이라는 다른 단자를 써 왔고, 두 규격은 모양이 달라 서로 꽂히지 않습니다.</w:t>
+        <w:t xml:space="preserve">NACS는 교류와 직류 급속 충전을 하나의 단자로 처리하는 작은 규격입니다. 기존 CCS1보다 작고 가볍다는 평가를 받습니다. 테슬라가 2022년에 설계를 공개하고 다른 완성차와 충전 사업자에게 쓰라고 권했습니다. 북미에서 테슬라 외 전기차 대부분은 CCS1이라는 다른 단자를 써 왔고, 두 규격은 모양이 달라 서로 꽂히지 않습니다.</w:t>
       </w:r>
     </w:p>
     <w:p>

</xml_diff>